<commit_message>
court(cafc) opening-brief: typst/latex/docx on the shared cross-engine layout model; latex 98.7 %, docx 99.7 % of lines alike, 22 pages each; params.cross_engine stays report (typst footnote widow, newtx advance drift) (fb-595.54.6)
</commit_message>
<xml_diff>
--- a/courts/federal-circuit/court-of-appeals/opening-brief/docx/reference.docx
+++ b/courts/federal-circuit/court-of-appeals/opening-brief/docx/reference.docx
@@ -193,7 +193,7 @@
     <w:name w:val="Normal"/>
     <w:qFormat/>
     <w:pPr>
-      <w:widowControl w:val="0"/>
+      <w:widowControl/>
       <w:spacing w:before="0" w:after="0" w:line="399" w:lineRule="exact"/>
     </w:pPr>
   </w:style>
@@ -235,6 +235,30 @@
       <w:jc w:val="left"/>
     </w:pPr>
   </w:style>
+  <!-- The brief's last paragraph: kept whole and with the signature block that follows (the typst template sets them
+       as one unbreakable block). -->
+  <w:style w:type="paragraph" w:customStyle="1" w:styleId="BodyTextKeep">
+    <w:name w:val="Body Text Keep"/>
+    <w:basedOn w:val="BodyText"/>
+    <w:qFormat/>
+    <w:pPr>
+      <w:keepNext/>
+      <w:keepLines/>
+      <w:spacing w:before="0" w:after="0" w:line="629" w:lineRule="exact"/>
+      <w:ind w:firstLine="720"/>
+    </w:pPr>
+  </w:style>
+  <!-- List items (lib/docx/xengine.lua, xe.list_items): the number or bullet in a half-inch box at the margin, the
+       text hanging after it, double spaced (lib/typst/xengine.typ lists). -->
+  <w:style w:type="paragraph" w:customStyle="1" w:styleId="ListItem">
+    <w:name w:val="List Item"/>
+    <w:basedOn w:val="BodyText"/>
+    <w:qFormat/>
+    <w:pPr>
+      <w:spacing w:before="0" w:after="0" w:line="629" w:lineRule="exact"/>
+      <w:ind w:left="720" w:hanging="720"/>
+    </w:pPr>
+  </w:style>
   <w:style w:type="paragraph" w:styleId="FirstParagraph">
     <w:name w:val="First Paragraph"/>
     <w:basedOn w:val="BodyText"/>
@@ -369,6 +393,8 @@
       <w:outlineLvl w:val="4"/>
     </w:pPr>
     <w:rPr>
+      <w:b/>
+      <w:bCs/>
       <w:i/>
       <w:iCs/>
     </w:rPr>
@@ -394,7 +420,7 @@
       <w:bCs/>
     </w:rPr>
   </w:style>
-  <!-- Centered point heading of an Argument (opening brief): bold small capitals. -->
+  <!-- Centered point heading of an Argument (opening brief): bold (the filter writes these as Heading 2, centered). -->
   <w:style w:type="paragraph" w:styleId="PointHeading">
     <w:name w:val="Point Heading"/>
     <w:basedOn w:val="Normal"/>
@@ -410,7 +436,6 @@
     <w:rPr>
       <w:b/>
       <w:bCs/>
-      <w:smallCaps/>
     </w:rPr>
   </w:style>
   <!-- Contents (table of contents) entries: label hung at its level's margin, title, right tab with dot leader. -->

</xml_diff>

<commit_message>
court(cafc) opening-brief: typst/latex/docx on the shared cross-engine layout model; XENG-001..003 pass on latex and docx, params.cross_engine: gate (fb-595.54.6)
</commit_message>
<xml_diff>
--- a/courts/federal-circuit/court-of-appeals/opening-brief/docx/reference.docx
+++ b/courts/federal-circuit/court-of-appeals/opening-brief/docx/reference.docx
@@ -244,6 +244,19 @@
     <w:pPr>
       <w:keepNext/>
       <w:keepLines/>
+      <w:spacing w:before="0" w:after="0" w:line="629" w:lineRule="exact"/>
+      <w:ind w:firstLine="720"/>
+    </w:pPr>
+  </w:style>
+  <!-- A body paragraph that anchors a footnote: no widow or orphan control. typst's widow rule does not see the note,
+       so a last line whose note does not fit moves to the next page alone; the filter (cafc-docx.lua) gives such
+       paragraphs this style so every engine breaks them alike. -->
+  <w:style w:type="paragraph" w:customStyle="1" w:styleId="BodyTextNote">
+    <w:name w:val="Body Text Note"/>
+    <w:basedOn w:val="BodyText"/>
+    <w:qFormat/>
+    <w:pPr>
+      <w:widowControl w:val="0"/>
       <w:spacing w:before="0" w:after="0" w:line="629" w:lineRule="exact"/>
       <w:ind w:firstLine="720"/>
     </w:pPr>

</xml_diff>